<commit_message>
Restructure pricing to Free/Standard/Pro/Enterprise(paused), fix registration validation, roll out CTA copy, add AI-visibility coming-soon page + scoping docs
</commit_message>
<xml_diff>
--- a/docs/product/2026-07-19-AI-Visibility-Tracking-Scoping.docx
+++ b/docs/product/2026-07-19-AI-Visibility-Tracking-Scoping.docx
@@ -972,6 +972,142 @@
       </w:pPr>
       <w:r>
         <w:t xml:space="preserve">Whether this replaces one of the dashboard's "coming soon" placeholders (Keywords/Content/Analytics) or ships as a new nav item — affects both nav structure and how "not yet built" honesty is maintained for the other two placeholders in the meantime.</w:t>
+      </w:r>
+    </w:p>
+    <w:p>
+      <w:pPr>
+        <w:pStyle w:val="ListParagraph"/>
+        <w:numPr>
+          <w:ilvl w:val="0"/>
+          <w:numId w:val="1"/>
+        </w:numPr>
+        <w:spacing w:after="80"/>
+      </w:pPr>
+      <w:r>
+        <w:t xml:space="preserve">How AI-visibility tracking is packaged/priced — bundled free into Pro/Enterprise (matches the existing quota columns, cheapest to build), a paid upsell on top of a subscription, or Sri’s separate one-time + “done-for-you” product line (Section 9). Explicitly deferred by Sri until the Option A vs. B build decision is made.</w:t>
+      </w:r>
+    </w:p>
+    <w:p>
+      <w:pPr>
+        <w:pStyle w:val="Heading1"/>
+        <w:spacing w:after="150" w:before="300"/>
+      </w:pPr>
+      <w:r>
+        <w:t xml:space="preserve">8. What this looks like in practice — a concrete example</w:t>
+      </w:r>
+    </w:p>
+    <w:p>
+      <w:pPr>
+        <w:spacing w:after="120"/>
+      </w:pPr>
+      <w:r>
+        <w:t xml:space="preserve">Take a mid-size CRM SaaS company — the same category the AI Overview Optimizer tool already uses as its own placeholder example ("Best CRM software for startups"). Today, a buyer shopping for a CRM increasingly asks ChatGPT or Perplexity directly ("what’s the best CRM for a 10-person sales team") or sees a Google AI Overview answer the question before any links even appear, instead of scrolling ten blue links. The AI reads a handful of sources and picks 2-7 to synthesize into one answer, and either names that CRM company or doesn’t.</w:t>
+      </w:r>
+    </w:p>
+    <w:p>
+      <w:pPr>
+        <w:spacing w:after="120"/>
+      </w:pPr>
+      <w:r>
+        <w:t xml:space="preserve">The problem for that company: Google Search Console shows clicks and impressions from traditional search, but nothing about whether ChatGPT mentioned them yesterday, whether Perplexity named a competitor instead, or whether their brand’s sentiment in Google’s AI Overview skews positive or critical (AI Overviews specifically skew more critical than ChatGPT, per the GEO research brief). The only way to know today is to manually ask each AI the same question repeatedly and take notes by hand — which nobody does consistently.</w:t>
+      </w:r>
+    </w:p>
+    <w:p>
+      <w:pPr>
+        <w:spacing w:after="120"/>
+      </w:pPr>
+      <w:r>
+        <w:t xml:space="preserve">That is the gap this feature fills: the company sets up a handful of queries it cares about ("best CRM for startups," "[competitor] alternatives," "CRM with the best free plan"), and gets back, per query, per AI engine — was the brand mentioned, where in the answer, what tone, how often — tracked over time so it reads as a trend, not a one-off snapshot. If a competitor starts showing up in ChatGPT’s answer and this company doesn’t, that is a signal to fix their content, the same way a keyword-rank drop is a signal in classic SEO.</w:t>
+      </w:r>
+    </w:p>
+    <w:p>
+      <w:pPr>
+        <w:spacing w:after="120"/>
+      </w:pPr>
+      <w:r>
+        <w:t xml:space="preserve">The businesses actually searching for a tool like this are the same ones already buying SHIJO’s SEO tools: marketing teams and agencies at SaaS companies, and e-commerce/DTC brands — anyone whose buyers now research by asking an AI a question instead of clicking search results.</w:t>
+      </w:r>
+    </w:p>
+    <w:p>
+      <w:pPr>
+        <w:pStyle w:val="Heading2"/>
+        <w:spacing w:after="120" w:before="240"/>
+      </w:pPr>
+      <w:r>
+        <w:t xml:space="preserve">Is this something a user comes back to check, or a one-time report?</w:t>
+      </w:r>
+    </w:p>
+    <w:p>
+      <w:pPr>
+        <w:spacing w:after="120"/>
+      </w:pPr>
+      <w:r>
+        <w:t xml:space="preserve">By design, recurring — this is the entire point of Section 3’s tracked_queries table and scheduled re-scan route. A user sets up a query once, and the product re-checks it on a schedule (weekly, placeholder) and keeps a history per query, which is what makes the per-query detail view (Section 5) worth opening more than once. This is a deliberately different shape from the existing AI Overview Optimizer tool, which is a single-shot audit with no memory — open it, get an answer, done. A tracking feature only earns repeat visits if it actually tracks; a one-time score would not.</w:t>
+      </w:r>
+    </w:p>
+    <w:p>
+      <w:pPr>
+        <w:pStyle w:val="Heading1"/>
+        <w:spacing w:after="150" w:before="300"/>
+      </w:pPr>
+      <w:r>
+        <w:t xml:space="preserve">9. Business model idea from Sri — recurring engagement + a paid "done-for-you" layer (not yet decided)</w:t>
+      </w:r>
+    </w:p>
+    <w:p>
+      <w:pPr>
+        <w:spacing w:after="120"/>
+      </w:pPr>
+      <w:r>
+        <w:t xml:space="preserve">Sri raised a real comparison worth recording: he used Attracta.com to submit his site and bought their upsell product, then later found the service had gone stale/outdated — the exact trap a tracking feature should avoid. The instinct behind this feature (recurring value that pulls users back to the product, not a one-time report they open once and forget) is the right one, and lines up with the retention gap the current AI Overview Optimizer has — it is used once per audit, not something a user has a reason to reopen.</w:t>
+      </w:r>
+    </w:p>
+    <w:p>
+      <w:pPr>
+        <w:spacing w:after="120"/>
+      </w:pPr>
+      <w:r>
+        <w:t xml:space="preserve">Sri’s idea, in his own framing: once real tracking exists, sell it two ways — a one-time product (e.g. a single deep audit/report) and a recurring "done-for-you" service where SHIJO (or its team) actively works a customer’s AI visibility on their behalf, not just reports on it. He was explicit that the shape of the "done-for-you" offering is not defined yet — recorded here as a real direction to scope later, not a decided plan. Two honesty notes for whoever scopes it: (1) a "done-for-you" service implies a human/managed-service layer on top of the software, which is a different kind of commitment (support staff, deliverables, SLAs) than anything SHIJO sells today — worth treating as its own business decision, not a checkbox on this feature; (2) whatever ships must keep working over time the way Attracta’s upsell reportedly didn’t — the recurring scan/history mechanism in Sections 3-5 is what keeps this from going stale, but only if the scheduled scan job actually keeps running and someone is watching that it does.</w:t>
+      </w:r>
+    </w:p>
+    <w:p>
+      <w:pPr>
+        <w:pStyle w:val="Heading1"/>
+        <w:spacing w:after="150" w:before="300"/>
+      </w:pPr>
+      <w:r>
+        <w:t xml:space="preserve">10. Naming &amp; discoverability — why "GEO" has to live in content, not just the tool’s name</w:t>
+      </w:r>
+    </w:p>
+    <w:p>
+      <w:pPr>
+        <w:spacing w:after="120"/>
+      </w:pPr>
+      <w:r>
+        <w:t xml:space="preserve">Sri’s question: the product doesn’t use the word "GEO" anywhere, so how would someone searching for that term find SHIJO.AI? Renaming the internal tool is not what controls this — what controls it is whether the site’s actual content (page titles, meta descriptions, blog posts) uses the terms people search for. A user never sees a tool’s internal name; they see page titles and body copy, and that is what both traditional SEO and GEO itself (per the research brief’s own mechanics — retrieval matches on content, not product names) key off of.</w:t>
+      </w:r>
+    </w:p>
+    <w:p>
+      <w:pPr>
+        <w:spacing w:after="120"/>
+      </w:pPr>
+      <w:r>
+        <w:rPr>
+          <w:b/>
+          <w:bCs/>
+        </w:rPr>
+        <w:t xml:space="preserve">Checked directly: </w:t>
+      </w:r>
+      <w:r>
+        <w:t xml:space="preserve">right now, zero pages on shijo.ai use "GEO," "generative engine optimization," or "AI visibility tracking" anywhere — not by oversight, but because an earlier session deliberately scrubbed exactly these phrases from the homepage title/meta description after finding they described a tracking capability that did not exist yet (the same fabricated-claim problem flagged throughout this project). That was the right call at the time. It also means SHIJO.AI is currently invisible to anyone searching or asking an AI about "GEO tools" or "AI visibility tracking software," in either Google or an LLM’s own answer — there is no content anywhere on the site an AI could retrieve and cite for that category, regardless of what the product is capable of internally.</w:t>
+      </w:r>
+    </w:p>
+    <w:p>
+      <w:pPr>
+        <w:spacing w:after="120"/>
+      </w:pPr>
+      <w:r>
+        <w:t xml:space="preserve">The two-step unlock: (1) ship real tracking capability (Option A at minimum, honestly labeled per Section 2), then (2) publish real content that uses the market’s actual language — a landing page, blog posts, updated page titles/meta descriptions — describing the real, now-true capability. Doing step 2 before step 1 repeats the fabricated-claim mistake already fixed once; doing step 1 without step 2 means the feature exists but stays undiscoverable by search or AI-citation. This is the same GEO mechanism from the research brief applied to SHIJO’s own site: being retrievable and citable requires real content using the real terms, not just having the underlying capability.</w:t>
       </w:r>
     </w:p>
     <w:sectPr>

</xml_diff>